<commit_message>
Keep presentation materials local and tidy project documentation
</commit_message>
<xml_diff>
--- a/docs/Integration_Hub_Project_Specification_Quality.docx
+++ b/docs/Integration_Hub_Project_Specification_Quality.docx
@@ -1895,43 +1895,6 @@
               <w:rPr>
                 <w:sz w:val="18"/>
               </w:rPr>
-              <w:t>Video demonstration script</w:t>
-            </w:r>
-          </w:p>
-        </w:tc>
-        <w:tc>
-          <w:tcPr>
-            <w:tcW w:type="dxa" w:w="4917"/>
-          </w:tcPr>
-          <w:p>
-            <w:pPr>
-              <w:spacing w:after="80"/>
-            </w:pPr>
-            <w:r>
-              <w:rPr>
-                <w:sz w:val="18"/>
-              </w:rPr>
-              <w:t>Timed screen-by-screen instructions; recording not created</w:t>
-            </w:r>
-          </w:p>
-        </w:tc>
-      </w:tr>
-      <w:tr>
-        <w:trPr>
-          <w:cantSplit/>
-        </w:trPr>
-        <w:tc>
-          <w:tcPr>
-            <w:tcW w:type="dxa" w:w="4917"/>
-          </w:tcPr>
-          <w:p>
-            <w:pPr>
-              <w:spacing w:after="80"/>
-            </w:pPr>
-            <w:r>
-              <w:rPr>
-                <w:sz w:val="18"/>
-              </w:rPr>
               <w:t>Setup, deployment, security and migration documentation</w:t>
             </w:r>
           </w:p>
@@ -1949,43 +1912,6 @@
                 <w:sz w:val="18"/>
               </w:rPr>
               <w:t>Included and linked from README</w:t>
-            </w:r>
-          </w:p>
-        </w:tc>
-      </w:tr>
-      <w:tr>
-        <w:trPr>
-          <w:cantSplit/>
-        </w:trPr>
-        <w:tc>
-          <w:tcPr>
-            <w:tcW w:type="dxa" w:w="4917"/>
-          </w:tcPr>
-          <w:p>
-            <w:pPr>
-              <w:spacing w:after="80"/>
-            </w:pPr>
-            <w:r>
-              <w:rPr>
-                <w:sz w:val="18"/>
-              </w:rPr>
-              <w:t>Public GitHub/Google Doc/video submission</w:t>
-            </w:r>
-          </w:p>
-        </w:tc>
-        <w:tc>
-          <w:tcPr>
-            <w:tcW w:type="dxa" w:w="4917"/>
-          </w:tcPr>
-          <w:p>
-            <w:pPr>
-              <w:spacing w:after="80"/>
-            </w:pPr>
-            <w:r>
-              <w:rPr>
-                <w:sz w:val="18"/>
-              </w:rPr>
-              <w:t>Not published/submitted automatically</w:t>
             </w:r>
           </w:p>
         </w:tc>
@@ -2020,7 +1946,7 @@
     </w:p>
     <w:p>
       <w:r>
-        <w:t>The project demonstrates agent decisions, multiple steps, read-only tools, persistent shared state, durable human approval and failure handling. Its local write is a concrete task outcome rather than a one-turn answer. Code, prompts, data, iterations and observations are documented. The remaining submission actions are recording a video under five minutes, preparing the shared Google Doc and publishing the intended code assets after review.</w:t>
+        <w:t>The project demonstrates agent decisions, multiple steps, read-only tools, persistent shared state, durable human approval and failure handling. Its local write is a concrete task outcome rather than a one-turn answer. Code, prompts, data, iterations and observations are documented.</w:t>
       </w:r>
     </w:p>
     <w:p>

</xml_diff>

<commit_message>
Improve planner handoffs and publish measured regression results
</commit_message>
<xml_diff>
--- a/docs/Integration_Hub_Project_Specification_Quality.docx
+++ b/docs/Integration_Hub_Project_Specification_Quality.docx
@@ -1959,12 +1959,17 @@
     </w:p>
     <w:p>
       <w:r>
-        <w:t>15/18 task checks passed (83.33%). Simulated approval completion: 12/12 eligible cases (100.0%).</w:t>
+        <w:t>18/18 task checks passed (100.0%). Simulated approval completion: 12/12 eligible cases (100.0%).</w:t>
       </w:r>
     </w:p>
     <w:p>
       <w:r>
-        <w:t>The current suite has 63 passing tests. Frontend build, lint and formatting checks passed. All eleven views passed browser navigation checks. The benchmark uses six baseline cases and twelve newly authored holdout cases, isolated storage and simulated approvals. Model-correction feedback survives backend restarts. The dashboard reads the same saved results. Earlier figures in this document are historical baseline measurements. See QUALITY_VERIFICATION.md for the complete evidence and limitations.</w:t>
+        <w:t>The current suite has 73 passing tests. Separate planner boundary checks passed 10/10; they measure tool selection only and are excluded from the workflow benchmark score. The six baseline and twelve original holdout cases now serve as development regressions after feedback-driven changes. They are not independent unseen validation. Evaluation storage and simulated approvals stay isolated. API and frontend-proxy dashboard responses match the complete saved result.</w:t>
+      </w:r>
+    </w:p>
+    <w:p>
+      <w:r>
+        <w:t>The planner requests missing evidence before retrieval, preserves searches for unfamiliar concrete failures and allows explicit requests for historical incidents. Model-correction feedback and approval state survive restarts. Earlier figures in this document are historical measurements. See QUALITY_VERIFICATION.md for complete evidence and limitations.</w:t>
       </w:r>
     </w:p>
     <w:sectPr>

</xml_diff>

<commit_message>
Improve investigation evidence, approvals, security and evaluation
</commit_message>
<xml_diff>
--- a/docs/Integration_Hub_Project_Specification_Quality.docx
+++ b/docs/Integration_Hub_Project_Specification_Quality.docx
@@ -1964,12 +1964,25 @@
     </w:p>
     <w:p>
       <w:r>
-        <w:t>The current suite has 73 passing tests. Separate planner boundary checks passed 10/10; they measure tool selection only and are excluded from the workflow benchmark score. The six baseline and twelve original holdout cases now serve as development regressions after feedback-driven changes. They are not independent unseen validation. Evaluation storage and simulated approvals stay isolated. API and frontend-proxy dashboard responses match the complete saved result.</w:t>
+        <w:t>The current suite has 110 passing tests. Separate planner boundary checks passed 10/10; they measure tool selection only and are excluded from the workflow benchmark score. The six baseline and twelve original holdout cases now serve as development regressions after feedback-driven changes. They are not independent unseen validation. Evaluation storage and simulated approvals stay isolated. API and frontend-proxy dashboard responses match the complete saved result.</w:t>
       </w:r>
     </w:p>
     <w:p>
       <w:r>
         <w:t>The planner requests missing evidence before retrieval, preserves searches for unfamiliar concrete failures and allows explicit requests for historical incidents. Model-correction feedback and approval state survive restarts. Earlier figures in this document are historical measurements. See QUALITY_VERIFICATION.md for complete evidence and limitations.</w:t>
+      </w:r>
+    </w:p>
+    <w:p>
+      <w:pPr>
+        <w:pStyle w:val="Heading1"/>
+      </w:pPr>
+      <w:r>
+        <w:t>Security and operational verification</w:t>
+      </w:r>
+    </w:p>
+    <w:p>
+      <w:r>
+        <w:t>Authentication is required by default. A browser connection screen keeps credentials in tab memory. Privacy filtering covers titles, nested records, model inputs/outputs, storage and exports; legacy data is filtered on read without claiming historical erasure. Request bodies are bounded even when streamed. Authenticated readiness and operations endpoints feed diagnostics. The full local workflow was rerun as eval-0ebc2478b3a7 with 18/18 passes and the separate planner suite passed 10/10. See SECURITY_VERIFICATION.md for the 110-test result, browser/API checks and production limitations.</w:t>
       </w:r>
     </w:p>
     <w:sectPr>

</xml_diff>